<commit_message>
Website HA-hardened state + ICT cl2/cl3 split
Establishes the website's HA-hardened state as the CL2 assessment baseline (narratively the output of CL3's website-hardening practice, provided directly):

- Website HA Hardening project (CL3 practice) + its HA Solution Design (docx/PDF + Multi-AZ architecture diagram); ledgerline-ha-hardening project entry added.
- ICT split: environment-overview / network-diagram / hardware-software-inventory each fork into -ha-hardened (CL2, website HA) and -cl3 (CL3, website single-AZ); website-server-status splits into single-AZ (CL1+CL3) and -ha (CL2). Students now see the correct website state per cluster.
- Diagrams reorganised: Solution-Design figures moved to public/diagrams/for-documents-not-website/; the three intranet network-state diagrams stay. Baseline Solution Design docx/PDF updated with its figure.

Co-Authored-By: Claude Opus 4.8 <noreply@anthropic.com>
</commit_message>
<xml_diff>
--- a/public/documents/YAT-Website-Baseline-Solution-Design.docx
+++ b/public/documents/YAT-Website-Baseline-Solution-Design.docx
@@ -3,6 +3,7 @@
 <w:document xmlns:wpc="http://schemas.microsoft.com/office/word/2010/wordprocessingCanvas" xmlns:cx="http://schemas.microsoft.com/office/drawing/2014/chartex" xmlns:cx1="http://schemas.microsoft.com/office/drawing/2015/9/8/chartex" xmlns:cx2="http://schemas.microsoft.com/office/drawing/2015/10/21/chartex" xmlns:cx3="http://schemas.microsoft.com/office/drawing/2016/5/9/chartex" xmlns:cx4="http://schemas.microsoft.com/office/drawing/2016/5/10/chartex" xmlns:cx5="http://schemas.microsoft.com/office/drawing/2016/5/11/chartex" xmlns:cx6="http://schemas.microsoft.com/office/drawing/2016/5/12/chartex" xmlns:cx7="http://schemas.microsoft.com/office/drawing/2016/5/13/chartex" xmlns:cx8="http://schemas.microsoft.com/office/drawing/2016/5/14/chartex" xmlns:mc="http://schemas.openxmlformats.org/markup-compatibility/2006" xmlns:aink="http://schemas.microsoft.com/office/drawing/2016/ink" xmlns:am3d="http://schemas.microsoft.com/office/drawing/2017/model3d" xmlns:o="urn:schemas-microsoft-com:office:office" xmlns:oel="http://schemas.microsoft.com/office/2019/extlst" xmlns:r="http://schemas.openxmlformats.org/officeDocument/2006/relationships" xmlns:m="http://schemas.openxmlformats.org/officeDocument/2006/math" xmlns:v="urn:schemas-microsoft-com:vml" xmlns:wp14="http://schemas.microsoft.com/office/word/2010/wordprocessingDrawing" xmlns:wp="http://schemas.openxmlformats.org/drawingml/2006/wordprocessingDrawing" xmlns:w10="urn:schemas-microsoft-com:office:word" xmlns:w="http://schemas.openxmlformats.org/wordprocessingml/2006/main" xmlns:w14="http://schemas.microsoft.com/office/word/2010/wordml" xmlns:w15="http://schemas.microsoft.com/office/word/2012/wordml" xmlns:w16cex="http://schemas.microsoft.com/office/word/2018/wordml/cex" xmlns:w16cid="http://schemas.microsoft.com/office/word/2016/wordml/cid" xmlns:w16="http://schemas.microsoft.com/office/word/2018/wordml" xmlns:w16du="http://schemas.microsoft.com/office/word/2023/wordml/word16du" xmlns:w16sdtdh="http://schemas.microsoft.com/office/word/2020/wordml/sdtdatahash" xmlns:w16sdtfl="http://schemas.microsoft.com/office/word/2024/wordml/sdtformatlock" xmlns:w16se="http://schemas.microsoft.com/office/word/2015/wordml/symex" xmlns:wpg="http://schemas.microsoft.com/office/word/2010/wordprocessingGroup" xmlns:wpi="http://schemas.microsoft.com/office/word/2010/wordprocessingInk" xmlns:wne="http://schemas.microsoft.com/office/word/2006/wordml" xmlns:wps="http://schemas.microsoft.com/office/word/2010/wordprocessingShape" mc:Ignorable="w14 w15 w16se w16cid w16 w16cex w16sdtdh w16sdtfl w16du wp14">
   <w:body>
     <w:p>
+      <w:proofErr w:type="gramStart"/>
       <w:r>
         <w:rPr>
           <w:b/>
@@ -19,6 +20,7 @@
         </w:rPr>
         <w:t xml:space="preserve">  COLLEGE</w:t>
       </w:r>
+      <w:proofErr w:type="gramEnd"/>
     </w:p>
     <w:p>
       <w:r>
@@ -26,7 +28,23 @@
           <w:color w:val="6B6660"/>
           <w:sz w:val="18"/>
         </w:rPr>
-        <w:t>YAT College  ·  175 Cremorne St, Cremorne VIC 3121</w:t>
+        <w:t xml:space="preserve">YAT </w:t>
+      </w:r>
+      <w:proofErr w:type="gramStart"/>
+      <w:r>
+        <w:rPr>
+          <w:color w:val="6B6660"/>
+          <w:sz w:val="18"/>
+        </w:rPr>
+        <w:t>College  ·</w:t>
+      </w:r>
+      <w:proofErr w:type="gramEnd"/>
+      <w:r>
+        <w:rPr>
+          <w:color w:val="6B6660"/>
+          <w:sz w:val="18"/>
+        </w:rPr>
+        <w:t xml:space="preserve">  175 Cremorne St, Cremorne VIC 3121</w:t>
       </w:r>
     </w:p>
     <w:p>
@@ -104,7 +122,21 @@
               <w:rPr>
                 <w:sz w:val="20"/>
               </w:rPr>
-              <w:t>YAT Website Cloud Migration (2023) — YAT's first cloud project</w:t>
+              <w:t>YAT Website Cloud Migration (</w:t>
+            </w:r>
+            <w:proofErr w:type="gramStart"/>
+            <w:r>
+              <w:rPr>
+                <w:sz w:val="20"/>
+              </w:rPr>
+              <w:t>2023) —</w:t>
+            </w:r>
+            <w:proofErr w:type="gramEnd"/>
+            <w:r>
+              <w:rPr>
+                <w:sz w:val="20"/>
+              </w:rPr>
+              <w:t xml:space="preserve"> YAT's first cloud project</w:t>
             </w:r>
           </w:p>
         </w:tc>
@@ -272,7 +304,21 @@
               <w:rPr>
                 <w:sz w:val="20"/>
               </w:rPr>
-              <w:t>Pat Lin (MTS Senior Consultant) · Sam Walker (YAT ICT Manager)</w:t>
+              <w:t xml:space="preserve">Pat Lin (MTS Senior </w:t>
+            </w:r>
+            <w:proofErr w:type="gramStart"/>
+            <w:r>
+              <w:rPr>
+                <w:sz w:val="20"/>
+              </w:rPr>
+              <w:t>Consultant) ·</w:t>
+            </w:r>
+            <w:proofErr w:type="gramEnd"/>
+            <w:r>
+              <w:rPr>
+                <w:sz w:val="20"/>
+              </w:rPr>
+              <w:t xml:space="preserve"> Sam Walker (YAT ICT Manager)</w:t>
             </w:r>
           </w:p>
         </w:tc>
@@ -378,7 +424,7 @@
       <w:pPr>
         <w:pStyle w:val="Heading1"/>
       </w:pPr>
-      <w:bookmarkStart w:id="0" w:name="_Toc231809578"/>
+      <w:bookmarkStart w:id="0" w:name="_Toc231819092"/>
       <w:r>
         <w:lastRenderedPageBreak/>
         <w:t>Contents</w:t>
@@ -392,7 +438,14 @@
           <w:tab w:val="right" w:leader="dot" w:pos="9402"/>
         </w:tabs>
         <w:rPr>
+          <w:rFonts w:asciiTheme="minorHAnsi" w:eastAsiaTheme="minorEastAsia" w:hAnsiTheme="minorHAnsi"/>
           <w:noProof/>
+          <w:color w:val="auto"/>
+          <w:kern w:val="2"/>
+          <w:sz w:val="24"/>
+          <w:szCs w:val="24"/>
+          <w:lang w:val="en-AU" w:eastAsia="en-AU"/>
+          <w14:ligatures w14:val="standardContextual"/>
         </w:rPr>
       </w:pPr>
       <w:r>
@@ -404,7 +457,7 @@
       <w:r>
         <w:fldChar w:fldCharType="separate"/>
       </w:r>
-      <w:hyperlink w:anchor="_Toc231809578" w:history="1">
+      <w:hyperlink w:anchor="_Toc231819092" w:history="1">
         <w:r>
           <w:rPr>
             <w:rStyle w:val="Hyperlink"/>
@@ -431,7 +484,7 @@
             <w:noProof/>
             <w:webHidden/>
           </w:rPr>
-          <w:instrText xml:space="preserve"> PAGEREF _Toc231809578 \h </w:instrText>
+          <w:instrText xml:space="preserve"> PAGEREF _Toc231819092 \h </w:instrText>
         </w:r>
         <w:r>
           <w:rPr>
@@ -469,10 +522,17 @@
           <w:tab w:val="right" w:leader="dot" w:pos="9402"/>
         </w:tabs>
         <w:rPr>
+          <w:rFonts w:asciiTheme="minorHAnsi" w:eastAsiaTheme="minorEastAsia" w:hAnsiTheme="minorHAnsi"/>
           <w:noProof/>
+          <w:color w:val="auto"/>
+          <w:kern w:val="2"/>
+          <w:sz w:val="24"/>
+          <w:szCs w:val="24"/>
+          <w:lang w:val="en-AU" w:eastAsia="en-AU"/>
+          <w14:ligatures w14:val="standardContextual"/>
         </w:rPr>
       </w:pPr>
-      <w:hyperlink w:anchor="_Toc231809579" w:history="1">
+      <w:hyperlink w:anchor="_Toc231819093" w:history="1">
         <w:r>
           <w:rPr>
             <w:rStyle w:val="Hyperlink"/>
@@ -499,7 +559,7 @@
             <w:noProof/>
             <w:webHidden/>
           </w:rPr>
-          <w:instrText xml:space="preserve"> PAGEREF _Toc231809579 \h </w:instrText>
+          <w:instrText xml:space="preserve"> PAGEREF _Toc231819093 \h </w:instrText>
         </w:r>
         <w:r>
           <w:rPr>
@@ -537,10 +597,17 @@
           <w:tab w:val="right" w:leader="dot" w:pos="9402"/>
         </w:tabs>
         <w:rPr>
+          <w:rFonts w:asciiTheme="minorHAnsi" w:eastAsiaTheme="minorEastAsia" w:hAnsiTheme="minorHAnsi"/>
           <w:noProof/>
+          <w:color w:val="auto"/>
+          <w:kern w:val="2"/>
+          <w:sz w:val="24"/>
+          <w:szCs w:val="24"/>
+          <w:lang w:val="en-AU" w:eastAsia="en-AU"/>
+          <w14:ligatures w14:val="standardContextual"/>
         </w:rPr>
       </w:pPr>
-      <w:hyperlink w:anchor="_Toc231809580" w:history="1">
+      <w:hyperlink w:anchor="_Toc231819094" w:history="1">
         <w:r>
           <w:rPr>
             <w:rStyle w:val="Hyperlink"/>
@@ -567,7 +634,7 @@
             <w:noProof/>
             <w:webHidden/>
           </w:rPr>
-          <w:instrText xml:space="preserve"> PAGEREF _Toc231809580 \h </w:instrText>
+          <w:instrText xml:space="preserve"> PAGEREF _Toc231819094 \h </w:instrText>
         </w:r>
         <w:r>
           <w:rPr>
@@ -605,10 +672,17 @@
           <w:tab w:val="right" w:leader="dot" w:pos="9402"/>
         </w:tabs>
         <w:rPr>
+          <w:rFonts w:asciiTheme="minorHAnsi" w:eastAsiaTheme="minorEastAsia" w:hAnsiTheme="minorHAnsi"/>
           <w:noProof/>
+          <w:color w:val="auto"/>
+          <w:kern w:val="2"/>
+          <w:sz w:val="24"/>
+          <w:szCs w:val="24"/>
+          <w:lang w:val="en-AU" w:eastAsia="en-AU"/>
+          <w14:ligatures w14:val="standardContextual"/>
         </w:rPr>
       </w:pPr>
-      <w:hyperlink w:anchor="_Toc231809581" w:history="1">
+      <w:hyperlink w:anchor="_Toc231819095" w:history="1">
         <w:r>
           <w:rPr>
             <w:rStyle w:val="Hyperlink"/>
@@ -635,7 +709,7 @@
             <w:noProof/>
             <w:webHidden/>
           </w:rPr>
-          <w:instrText xml:space="preserve"> PAGEREF _Toc231809581 \h </w:instrText>
+          <w:instrText xml:space="preserve"> PAGEREF _Toc231819095 \h </w:instrText>
         </w:r>
         <w:r>
           <w:rPr>
@@ -673,10 +747,17 @@
           <w:tab w:val="right" w:leader="dot" w:pos="9402"/>
         </w:tabs>
         <w:rPr>
+          <w:rFonts w:asciiTheme="minorHAnsi" w:eastAsiaTheme="minorEastAsia" w:hAnsiTheme="minorHAnsi"/>
           <w:noProof/>
+          <w:color w:val="auto"/>
+          <w:kern w:val="2"/>
+          <w:sz w:val="24"/>
+          <w:szCs w:val="24"/>
+          <w:lang w:val="en-AU" w:eastAsia="en-AU"/>
+          <w14:ligatures w14:val="standardContextual"/>
         </w:rPr>
       </w:pPr>
-      <w:hyperlink w:anchor="_Toc231809582" w:history="1">
+      <w:hyperlink w:anchor="_Toc231819096" w:history="1">
         <w:r>
           <w:rPr>
             <w:rStyle w:val="Hyperlink"/>
@@ -703,7 +784,7 @@
             <w:noProof/>
             <w:webHidden/>
           </w:rPr>
-          <w:instrText xml:space="preserve"> PAGEREF _Toc231809582 \h </w:instrText>
+          <w:instrText xml:space="preserve"> PAGEREF _Toc231819096 \h </w:instrText>
         </w:r>
         <w:r>
           <w:rPr>
@@ -741,10 +822,17 @@
           <w:tab w:val="right" w:leader="dot" w:pos="9402"/>
         </w:tabs>
         <w:rPr>
+          <w:rFonts w:asciiTheme="minorHAnsi" w:eastAsiaTheme="minorEastAsia" w:hAnsiTheme="minorHAnsi"/>
           <w:noProof/>
+          <w:color w:val="auto"/>
+          <w:kern w:val="2"/>
+          <w:sz w:val="24"/>
+          <w:szCs w:val="24"/>
+          <w:lang w:val="en-AU" w:eastAsia="en-AU"/>
+          <w14:ligatures w14:val="standardContextual"/>
         </w:rPr>
       </w:pPr>
-      <w:hyperlink w:anchor="_Toc231809583" w:history="1">
+      <w:hyperlink w:anchor="_Toc231819097" w:history="1">
         <w:r>
           <w:rPr>
             <w:rStyle w:val="Hyperlink"/>
@@ -771,7 +859,7 @@
             <w:noProof/>
             <w:webHidden/>
           </w:rPr>
-          <w:instrText xml:space="preserve"> PAGEREF _Toc231809583 \h </w:instrText>
+          <w:instrText xml:space="preserve"> PAGEREF _Toc231819097 \h </w:instrText>
         </w:r>
         <w:r>
           <w:rPr>
@@ -809,10 +897,17 @@
           <w:tab w:val="right" w:leader="dot" w:pos="9402"/>
         </w:tabs>
         <w:rPr>
+          <w:rFonts w:asciiTheme="minorHAnsi" w:eastAsiaTheme="minorEastAsia" w:hAnsiTheme="minorHAnsi"/>
           <w:noProof/>
+          <w:color w:val="auto"/>
+          <w:kern w:val="2"/>
+          <w:sz w:val="24"/>
+          <w:szCs w:val="24"/>
+          <w:lang w:val="en-AU" w:eastAsia="en-AU"/>
+          <w14:ligatures w14:val="standardContextual"/>
         </w:rPr>
       </w:pPr>
-      <w:hyperlink w:anchor="_Toc231809584" w:history="1">
+      <w:hyperlink w:anchor="_Toc231819098" w:history="1">
         <w:r>
           <w:rPr>
             <w:rStyle w:val="Hyperlink"/>
@@ -839,7 +934,7 @@
             <w:noProof/>
             <w:webHidden/>
           </w:rPr>
-          <w:instrText xml:space="preserve"> PAGEREF _Toc231809584 \h </w:instrText>
+          <w:instrText xml:space="preserve"> PAGEREF _Toc231819098 \h </w:instrText>
         </w:r>
         <w:r>
           <w:rPr>
@@ -877,10 +972,17 @@
           <w:tab w:val="right" w:leader="dot" w:pos="9402"/>
         </w:tabs>
         <w:rPr>
+          <w:rFonts w:asciiTheme="minorHAnsi" w:eastAsiaTheme="minorEastAsia" w:hAnsiTheme="minorHAnsi"/>
           <w:noProof/>
+          <w:color w:val="auto"/>
+          <w:kern w:val="2"/>
+          <w:sz w:val="24"/>
+          <w:szCs w:val="24"/>
+          <w:lang w:val="en-AU" w:eastAsia="en-AU"/>
+          <w14:ligatures w14:val="standardContextual"/>
         </w:rPr>
       </w:pPr>
-      <w:hyperlink w:anchor="_Toc231809585" w:history="1">
+      <w:hyperlink w:anchor="_Toc231819099" w:history="1">
         <w:r>
           <w:rPr>
             <w:rStyle w:val="Hyperlink"/>
@@ -907,7 +1009,7 @@
             <w:noProof/>
             <w:webHidden/>
           </w:rPr>
-          <w:instrText xml:space="preserve"> PAGEREF _Toc231809585 \h </w:instrText>
+          <w:instrText xml:space="preserve"> PAGEREF _Toc231819099 \h </w:instrText>
         </w:r>
         <w:r>
           <w:rPr>
@@ -945,10 +1047,17 @@
           <w:tab w:val="right" w:leader="dot" w:pos="9402"/>
         </w:tabs>
         <w:rPr>
+          <w:rFonts w:asciiTheme="minorHAnsi" w:eastAsiaTheme="minorEastAsia" w:hAnsiTheme="minorHAnsi"/>
           <w:noProof/>
+          <w:color w:val="auto"/>
+          <w:kern w:val="2"/>
+          <w:sz w:val="24"/>
+          <w:szCs w:val="24"/>
+          <w:lang w:val="en-AU" w:eastAsia="en-AU"/>
+          <w14:ligatures w14:val="standardContextual"/>
         </w:rPr>
       </w:pPr>
-      <w:hyperlink w:anchor="_Toc231809586" w:history="1">
+      <w:hyperlink w:anchor="_Toc231819100" w:history="1">
         <w:r>
           <w:rPr>
             <w:rStyle w:val="Hyperlink"/>
@@ -975,7 +1084,7 @@
             <w:noProof/>
             <w:webHidden/>
           </w:rPr>
-          <w:instrText xml:space="preserve"> PAGEREF _Toc231809586 \h </w:instrText>
+          <w:instrText xml:space="preserve"> PAGEREF _Toc231819100 \h </w:instrText>
         </w:r>
         <w:r>
           <w:rPr>
@@ -1013,10 +1122,17 @@
           <w:tab w:val="right" w:leader="dot" w:pos="9402"/>
         </w:tabs>
         <w:rPr>
+          <w:rFonts w:asciiTheme="minorHAnsi" w:eastAsiaTheme="minorEastAsia" w:hAnsiTheme="minorHAnsi"/>
           <w:noProof/>
+          <w:color w:val="auto"/>
+          <w:kern w:val="2"/>
+          <w:sz w:val="24"/>
+          <w:szCs w:val="24"/>
+          <w:lang w:val="en-AU" w:eastAsia="en-AU"/>
+          <w14:ligatures w14:val="standardContextual"/>
         </w:rPr>
       </w:pPr>
-      <w:hyperlink w:anchor="_Toc231809587" w:history="1">
+      <w:hyperlink w:anchor="_Toc231819101" w:history="1">
         <w:r>
           <w:rPr>
             <w:rStyle w:val="Hyperlink"/>
@@ -1043,7 +1159,7 @@
             <w:noProof/>
             <w:webHidden/>
           </w:rPr>
-          <w:instrText xml:space="preserve"> PAGEREF _Toc231809587 \h </w:instrText>
+          <w:instrText xml:space="preserve"> PAGEREF _Toc231819101 \h </w:instrText>
         </w:r>
         <w:r>
           <w:rPr>
@@ -1081,10 +1197,17 @@
           <w:tab w:val="right" w:leader="dot" w:pos="9402"/>
         </w:tabs>
         <w:rPr>
+          <w:rFonts w:asciiTheme="minorHAnsi" w:eastAsiaTheme="minorEastAsia" w:hAnsiTheme="minorHAnsi"/>
           <w:noProof/>
+          <w:color w:val="auto"/>
+          <w:kern w:val="2"/>
+          <w:sz w:val="24"/>
+          <w:szCs w:val="24"/>
+          <w:lang w:val="en-AU" w:eastAsia="en-AU"/>
+          <w14:ligatures w14:val="standardContextual"/>
         </w:rPr>
       </w:pPr>
-      <w:hyperlink w:anchor="_Toc231809588" w:history="1">
+      <w:hyperlink w:anchor="_Toc231819102" w:history="1">
         <w:r>
           <w:rPr>
             <w:rStyle w:val="Hyperlink"/>
@@ -1111,7 +1234,7 @@
             <w:noProof/>
             <w:webHidden/>
           </w:rPr>
-          <w:instrText xml:space="preserve"> PAGEREF _Toc231809588 \h </w:instrText>
+          <w:instrText xml:space="preserve"> PAGEREF _Toc231819102 \h </w:instrText>
         </w:r>
         <w:r>
           <w:rPr>
@@ -1149,10 +1272,17 @@
           <w:tab w:val="right" w:leader="dot" w:pos="9402"/>
         </w:tabs>
         <w:rPr>
+          <w:rFonts w:asciiTheme="minorHAnsi" w:eastAsiaTheme="minorEastAsia" w:hAnsiTheme="minorHAnsi"/>
           <w:noProof/>
+          <w:color w:val="auto"/>
+          <w:kern w:val="2"/>
+          <w:sz w:val="24"/>
+          <w:szCs w:val="24"/>
+          <w:lang w:val="en-AU" w:eastAsia="en-AU"/>
+          <w14:ligatures w14:val="standardContextual"/>
         </w:rPr>
       </w:pPr>
-      <w:hyperlink w:anchor="_Toc231809589" w:history="1">
+      <w:hyperlink w:anchor="_Toc231819103" w:history="1">
         <w:r>
           <w:rPr>
             <w:rStyle w:val="Hyperlink"/>
@@ -1179,7 +1309,7 @@
             <w:noProof/>
             <w:webHidden/>
           </w:rPr>
-          <w:instrText xml:space="preserve"> PAGEREF _Toc231809589 \h </w:instrText>
+          <w:instrText xml:space="preserve"> PAGEREF _Toc231819103 \h </w:instrText>
         </w:r>
         <w:r>
           <w:rPr>
@@ -1217,10 +1347,17 @@
           <w:tab w:val="right" w:leader="dot" w:pos="9402"/>
         </w:tabs>
         <w:rPr>
+          <w:rFonts w:asciiTheme="minorHAnsi" w:eastAsiaTheme="minorEastAsia" w:hAnsiTheme="minorHAnsi"/>
           <w:noProof/>
+          <w:color w:val="auto"/>
+          <w:kern w:val="2"/>
+          <w:sz w:val="24"/>
+          <w:szCs w:val="24"/>
+          <w:lang w:val="en-AU" w:eastAsia="en-AU"/>
+          <w14:ligatures w14:val="standardContextual"/>
         </w:rPr>
       </w:pPr>
-      <w:hyperlink w:anchor="_Toc231809590" w:history="1">
+      <w:hyperlink w:anchor="_Toc231819104" w:history="1">
         <w:r>
           <w:rPr>
             <w:rStyle w:val="Hyperlink"/>
@@ -1247,7 +1384,7 @@
             <w:noProof/>
             <w:webHidden/>
           </w:rPr>
-          <w:instrText xml:space="preserve"> PAGEREF _Toc231809590 \h </w:instrText>
+          <w:instrText xml:space="preserve"> PAGEREF _Toc231819104 \h </w:instrText>
         </w:r>
         <w:r>
           <w:rPr>
@@ -1285,10 +1422,17 @@
           <w:tab w:val="right" w:leader="dot" w:pos="9402"/>
         </w:tabs>
         <w:rPr>
+          <w:rFonts w:asciiTheme="minorHAnsi" w:eastAsiaTheme="minorEastAsia" w:hAnsiTheme="minorHAnsi"/>
           <w:noProof/>
+          <w:color w:val="auto"/>
+          <w:kern w:val="2"/>
+          <w:sz w:val="24"/>
+          <w:szCs w:val="24"/>
+          <w:lang w:val="en-AU" w:eastAsia="en-AU"/>
+          <w14:ligatures w14:val="standardContextual"/>
         </w:rPr>
       </w:pPr>
-      <w:hyperlink w:anchor="_Toc231809591" w:history="1">
+      <w:hyperlink w:anchor="_Toc231819105" w:history="1">
         <w:r>
           <w:rPr>
             <w:rStyle w:val="Hyperlink"/>
@@ -1315,7 +1459,7 @@
             <w:noProof/>
             <w:webHidden/>
           </w:rPr>
-          <w:instrText xml:space="preserve"> PAGEREF _Toc231809591 \h </w:instrText>
+          <w:instrText xml:space="preserve"> PAGEREF _Toc231819105 \h </w:instrText>
         </w:r>
         <w:r>
           <w:rPr>
@@ -1353,10 +1497,17 @@
           <w:tab w:val="right" w:leader="dot" w:pos="9402"/>
         </w:tabs>
         <w:rPr>
+          <w:rFonts w:asciiTheme="minorHAnsi" w:eastAsiaTheme="minorEastAsia" w:hAnsiTheme="minorHAnsi"/>
           <w:noProof/>
+          <w:color w:val="auto"/>
+          <w:kern w:val="2"/>
+          <w:sz w:val="24"/>
+          <w:szCs w:val="24"/>
+          <w:lang w:val="en-AU" w:eastAsia="en-AU"/>
+          <w14:ligatures w14:val="standardContextual"/>
         </w:rPr>
       </w:pPr>
-      <w:hyperlink w:anchor="_Toc231809592" w:history="1">
+      <w:hyperlink w:anchor="_Toc231819106" w:history="1">
         <w:r>
           <w:rPr>
             <w:rStyle w:val="Hyperlink"/>
@@ -1383,7 +1534,7 @@
             <w:noProof/>
             <w:webHidden/>
           </w:rPr>
-          <w:instrText xml:space="preserve"> PAGEREF _Toc231809592 \h </w:instrText>
+          <w:instrText xml:space="preserve"> PAGEREF _Toc231819106 \h </w:instrText>
         </w:r>
         <w:r>
           <w:rPr>
@@ -1421,10 +1572,17 @@
           <w:tab w:val="right" w:leader="dot" w:pos="9402"/>
         </w:tabs>
         <w:rPr>
+          <w:rFonts w:asciiTheme="minorHAnsi" w:eastAsiaTheme="minorEastAsia" w:hAnsiTheme="minorHAnsi"/>
           <w:noProof/>
+          <w:color w:val="auto"/>
+          <w:kern w:val="2"/>
+          <w:sz w:val="24"/>
+          <w:szCs w:val="24"/>
+          <w:lang w:val="en-AU" w:eastAsia="en-AU"/>
+          <w14:ligatures w14:val="standardContextual"/>
         </w:rPr>
       </w:pPr>
-      <w:hyperlink w:anchor="_Toc231809593" w:history="1">
+      <w:hyperlink w:anchor="_Toc231819107" w:history="1">
         <w:r>
           <w:rPr>
             <w:rStyle w:val="Hyperlink"/>
@@ -1451,7 +1609,7 @@
             <w:noProof/>
             <w:webHidden/>
           </w:rPr>
-          <w:instrText xml:space="preserve"> PAGEREF _Toc231809593 \h </w:instrText>
+          <w:instrText xml:space="preserve"> PAGEREF _Toc231819107 \h </w:instrText>
         </w:r>
         <w:r>
           <w:rPr>
@@ -1489,10 +1647,17 @@
           <w:tab w:val="right" w:leader="dot" w:pos="9402"/>
         </w:tabs>
         <w:rPr>
+          <w:rFonts w:asciiTheme="minorHAnsi" w:eastAsiaTheme="minorEastAsia" w:hAnsiTheme="minorHAnsi"/>
           <w:noProof/>
+          <w:color w:val="auto"/>
+          <w:kern w:val="2"/>
+          <w:sz w:val="24"/>
+          <w:szCs w:val="24"/>
+          <w:lang w:val="en-AU" w:eastAsia="en-AU"/>
+          <w14:ligatures w14:val="standardContextual"/>
         </w:rPr>
       </w:pPr>
-      <w:hyperlink w:anchor="_Toc231809594" w:history="1">
+      <w:hyperlink w:anchor="_Toc231819108" w:history="1">
         <w:r>
           <w:rPr>
             <w:rStyle w:val="Hyperlink"/>
@@ -1519,7 +1684,7 @@
             <w:noProof/>
             <w:webHidden/>
           </w:rPr>
-          <w:instrText xml:space="preserve"> PAGEREF _Toc231809594 \h </w:instrText>
+          <w:instrText xml:space="preserve"> PAGEREF _Toc231819108 \h </w:instrText>
         </w:r>
         <w:r>
           <w:rPr>
@@ -1557,10 +1722,17 @@
           <w:tab w:val="right" w:leader="dot" w:pos="9402"/>
         </w:tabs>
         <w:rPr>
+          <w:rFonts w:asciiTheme="minorHAnsi" w:eastAsiaTheme="minorEastAsia" w:hAnsiTheme="minorHAnsi"/>
           <w:noProof/>
+          <w:color w:val="auto"/>
+          <w:kern w:val="2"/>
+          <w:sz w:val="24"/>
+          <w:szCs w:val="24"/>
+          <w:lang w:val="en-AU" w:eastAsia="en-AU"/>
+          <w14:ligatures w14:val="standardContextual"/>
         </w:rPr>
       </w:pPr>
-      <w:hyperlink w:anchor="_Toc231809595" w:history="1">
+      <w:hyperlink w:anchor="_Toc231819109" w:history="1">
         <w:r>
           <w:rPr>
             <w:rStyle w:val="Hyperlink"/>
@@ -1587,7 +1759,7 @@
             <w:noProof/>
             <w:webHidden/>
           </w:rPr>
-          <w:instrText xml:space="preserve"> PAGEREF _Toc231809595 \h </w:instrText>
+          <w:instrText xml:space="preserve"> PAGEREF _Toc231819109 \h </w:instrText>
         </w:r>
         <w:r>
           <w:rPr>
@@ -1625,10 +1797,17 @@
           <w:tab w:val="right" w:leader="dot" w:pos="9402"/>
         </w:tabs>
         <w:rPr>
+          <w:rFonts w:asciiTheme="minorHAnsi" w:eastAsiaTheme="minorEastAsia" w:hAnsiTheme="minorHAnsi"/>
           <w:noProof/>
+          <w:color w:val="auto"/>
+          <w:kern w:val="2"/>
+          <w:sz w:val="24"/>
+          <w:szCs w:val="24"/>
+          <w:lang w:val="en-AU" w:eastAsia="en-AU"/>
+          <w14:ligatures w14:val="standardContextual"/>
         </w:rPr>
       </w:pPr>
-      <w:hyperlink w:anchor="_Toc231809596" w:history="1">
+      <w:hyperlink w:anchor="_Toc231819110" w:history="1">
         <w:r>
           <w:rPr>
             <w:rStyle w:val="Hyperlink"/>
@@ -1655,7 +1834,7 @@
             <w:noProof/>
             <w:webHidden/>
           </w:rPr>
-          <w:instrText xml:space="preserve"> PAGEREF _Toc231809596 \h </w:instrText>
+          <w:instrText xml:space="preserve"> PAGEREF _Toc231819110 \h </w:instrText>
         </w:r>
         <w:r>
           <w:rPr>
@@ -1693,10 +1872,17 @@
           <w:tab w:val="right" w:leader="dot" w:pos="9402"/>
         </w:tabs>
         <w:rPr>
+          <w:rFonts w:asciiTheme="minorHAnsi" w:eastAsiaTheme="minorEastAsia" w:hAnsiTheme="minorHAnsi"/>
           <w:noProof/>
+          <w:color w:val="auto"/>
+          <w:kern w:val="2"/>
+          <w:sz w:val="24"/>
+          <w:szCs w:val="24"/>
+          <w:lang w:val="en-AU" w:eastAsia="en-AU"/>
+          <w14:ligatures w14:val="standardContextual"/>
         </w:rPr>
       </w:pPr>
-      <w:hyperlink w:anchor="_Toc231809597" w:history="1">
+      <w:hyperlink w:anchor="_Toc231819111" w:history="1">
         <w:r>
           <w:rPr>
             <w:rStyle w:val="Hyperlink"/>
@@ -1723,7 +1909,7 @@
             <w:noProof/>
             <w:webHidden/>
           </w:rPr>
-          <w:instrText xml:space="preserve"> PAGEREF _Toc231809597 \h </w:instrText>
+          <w:instrText xml:space="preserve"> PAGEREF _Toc231819111 \h </w:instrText>
         </w:r>
         <w:r>
           <w:rPr>
@@ -1761,10 +1947,17 @@
           <w:tab w:val="right" w:leader="dot" w:pos="9402"/>
         </w:tabs>
         <w:rPr>
+          <w:rFonts w:asciiTheme="minorHAnsi" w:eastAsiaTheme="minorEastAsia" w:hAnsiTheme="minorHAnsi"/>
           <w:noProof/>
+          <w:color w:val="auto"/>
+          <w:kern w:val="2"/>
+          <w:sz w:val="24"/>
+          <w:szCs w:val="24"/>
+          <w:lang w:val="en-AU" w:eastAsia="en-AU"/>
+          <w14:ligatures w14:val="standardContextual"/>
         </w:rPr>
       </w:pPr>
-      <w:hyperlink w:anchor="_Toc231809598" w:history="1">
+      <w:hyperlink w:anchor="_Toc231819112" w:history="1">
         <w:r>
           <w:rPr>
             <w:rStyle w:val="Hyperlink"/>
@@ -1791,7 +1984,7 @@
             <w:noProof/>
             <w:webHidden/>
           </w:rPr>
-          <w:instrText xml:space="preserve"> PAGEREF _Toc231809598 \h </w:instrText>
+          <w:instrText xml:space="preserve"> PAGEREF _Toc231819112 \h </w:instrText>
         </w:r>
         <w:r>
           <w:rPr>
@@ -1829,10 +2022,17 @@
           <w:tab w:val="right" w:leader="dot" w:pos="9402"/>
         </w:tabs>
         <w:rPr>
+          <w:rFonts w:asciiTheme="minorHAnsi" w:eastAsiaTheme="minorEastAsia" w:hAnsiTheme="minorHAnsi"/>
           <w:noProof/>
+          <w:color w:val="auto"/>
+          <w:kern w:val="2"/>
+          <w:sz w:val="24"/>
+          <w:szCs w:val="24"/>
+          <w:lang w:val="en-AU" w:eastAsia="en-AU"/>
+          <w14:ligatures w14:val="standardContextual"/>
         </w:rPr>
       </w:pPr>
-      <w:hyperlink w:anchor="_Toc231809599" w:history="1">
+      <w:hyperlink w:anchor="_Toc231819113" w:history="1">
         <w:r>
           <w:rPr>
             <w:rStyle w:val="Hyperlink"/>
@@ -1859,7 +2059,7 @@
             <w:noProof/>
             <w:webHidden/>
           </w:rPr>
-          <w:instrText xml:space="preserve"> PAGEREF _Toc231809599 \h </w:instrText>
+          <w:instrText xml:space="preserve"> PAGEREF _Toc231819113 \h </w:instrText>
         </w:r>
         <w:r>
           <w:rPr>
@@ -1897,10 +2097,17 @@
           <w:tab w:val="right" w:leader="dot" w:pos="9402"/>
         </w:tabs>
         <w:rPr>
+          <w:rFonts w:asciiTheme="minorHAnsi" w:eastAsiaTheme="minorEastAsia" w:hAnsiTheme="minorHAnsi"/>
           <w:noProof/>
+          <w:color w:val="auto"/>
+          <w:kern w:val="2"/>
+          <w:sz w:val="24"/>
+          <w:szCs w:val="24"/>
+          <w:lang w:val="en-AU" w:eastAsia="en-AU"/>
+          <w14:ligatures w14:val="standardContextual"/>
         </w:rPr>
       </w:pPr>
-      <w:hyperlink w:anchor="_Toc231809600" w:history="1">
+      <w:hyperlink w:anchor="_Toc231819114" w:history="1">
         <w:r>
           <w:rPr>
             <w:rStyle w:val="Hyperlink"/>
@@ -1927,7 +2134,7 @@
             <w:noProof/>
             <w:webHidden/>
           </w:rPr>
-          <w:instrText xml:space="preserve"> PAGEREF _Toc231809600 \h </w:instrText>
+          <w:instrText xml:space="preserve"> PAGEREF _Toc231819114 \h </w:instrText>
         </w:r>
         <w:r>
           <w:rPr>
@@ -1965,10 +2172,17 @@
           <w:tab w:val="right" w:leader="dot" w:pos="9402"/>
         </w:tabs>
         <w:rPr>
+          <w:rFonts w:asciiTheme="minorHAnsi" w:eastAsiaTheme="minorEastAsia" w:hAnsiTheme="minorHAnsi"/>
           <w:noProof/>
+          <w:color w:val="auto"/>
+          <w:kern w:val="2"/>
+          <w:sz w:val="24"/>
+          <w:szCs w:val="24"/>
+          <w:lang w:val="en-AU" w:eastAsia="en-AU"/>
+          <w14:ligatures w14:val="standardContextual"/>
         </w:rPr>
       </w:pPr>
-      <w:hyperlink w:anchor="_Toc231809601" w:history="1">
+      <w:hyperlink w:anchor="_Toc231819115" w:history="1">
         <w:r>
           <w:rPr>
             <w:rStyle w:val="Hyperlink"/>
@@ -1995,7 +2209,7 @@
             <w:noProof/>
             <w:webHidden/>
           </w:rPr>
-          <w:instrText xml:space="preserve"> PAGEREF _Toc231809601 \h </w:instrText>
+          <w:instrText xml:space="preserve"> PAGEREF _Toc231819115 \h </w:instrText>
         </w:r>
         <w:r>
           <w:rPr>
@@ -2033,10 +2247,17 @@
           <w:tab w:val="right" w:leader="dot" w:pos="9402"/>
         </w:tabs>
         <w:rPr>
+          <w:rFonts w:asciiTheme="minorHAnsi" w:eastAsiaTheme="minorEastAsia" w:hAnsiTheme="minorHAnsi"/>
           <w:noProof/>
+          <w:color w:val="auto"/>
+          <w:kern w:val="2"/>
+          <w:sz w:val="24"/>
+          <w:szCs w:val="24"/>
+          <w:lang w:val="en-AU" w:eastAsia="en-AU"/>
+          <w14:ligatures w14:val="standardContextual"/>
         </w:rPr>
       </w:pPr>
-      <w:hyperlink w:anchor="_Toc231809602" w:history="1">
+      <w:hyperlink w:anchor="_Toc231819116" w:history="1">
         <w:r>
           <w:rPr>
             <w:rStyle w:val="Hyperlink"/>
@@ -2063,7 +2284,7 @@
             <w:noProof/>
             <w:webHidden/>
           </w:rPr>
-          <w:instrText xml:space="preserve"> PAGEREF _Toc231809602 \h </w:instrText>
+          <w:instrText xml:space="preserve"> PAGEREF _Toc231819116 \h </w:instrText>
         </w:r>
         <w:r>
           <w:rPr>
@@ -2101,10 +2322,17 @@
           <w:tab w:val="right" w:leader="dot" w:pos="9402"/>
         </w:tabs>
         <w:rPr>
+          <w:rFonts w:asciiTheme="minorHAnsi" w:eastAsiaTheme="minorEastAsia" w:hAnsiTheme="minorHAnsi"/>
           <w:noProof/>
+          <w:color w:val="auto"/>
+          <w:kern w:val="2"/>
+          <w:sz w:val="24"/>
+          <w:szCs w:val="24"/>
+          <w:lang w:val="en-AU" w:eastAsia="en-AU"/>
+          <w14:ligatures w14:val="standardContextual"/>
         </w:rPr>
       </w:pPr>
-      <w:hyperlink w:anchor="_Toc231809603" w:history="1">
+      <w:hyperlink w:anchor="_Toc231819117" w:history="1">
         <w:r>
           <w:rPr>
             <w:rStyle w:val="Hyperlink"/>
@@ -2131,7 +2359,7 @@
             <w:noProof/>
             <w:webHidden/>
           </w:rPr>
-          <w:instrText xml:space="preserve"> PAGEREF _Toc231809603 \h </w:instrText>
+          <w:instrText xml:space="preserve"> PAGEREF _Toc231819117 \h </w:instrText>
         </w:r>
         <w:r>
           <w:rPr>
@@ -2169,10 +2397,17 @@
           <w:tab w:val="right" w:leader="dot" w:pos="9402"/>
         </w:tabs>
         <w:rPr>
+          <w:rFonts w:asciiTheme="minorHAnsi" w:eastAsiaTheme="minorEastAsia" w:hAnsiTheme="minorHAnsi"/>
           <w:noProof/>
+          <w:color w:val="auto"/>
+          <w:kern w:val="2"/>
+          <w:sz w:val="24"/>
+          <w:szCs w:val="24"/>
+          <w:lang w:val="en-AU" w:eastAsia="en-AU"/>
+          <w14:ligatures w14:val="standardContextual"/>
         </w:rPr>
       </w:pPr>
-      <w:hyperlink w:anchor="_Toc231809604" w:history="1">
+      <w:hyperlink w:anchor="_Toc231819118" w:history="1">
         <w:r>
           <w:rPr>
             <w:rStyle w:val="Hyperlink"/>
@@ -2199,7 +2434,7 @@
             <w:noProof/>
             <w:webHidden/>
           </w:rPr>
-          <w:instrText xml:space="preserve"> PAGEREF _Toc231809604 \h </w:instrText>
+          <w:instrText xml:space="preserve"> PAGEREF _Toc231819118 \h </w:instrText>
         </w:r>
         <w:r>
           <w:rPr>
@@ -2237,10 +2472,17 @@
           <w:tab w:val="right" w:leader="dot" w:pos="9402"/>
         </w:tabs>
         <w:rPr>
+          <w:rFonts w:asciiTheme="minorHAnsi" w:eastAsiaTheme="minorEastAsia" w:hAnsiTheme="minorHAnsi"/>
           <w:noProof/>
+          <w:color w:val="auto"/>
+          <w:kern w:val="2"/>
+          <w:sz w:val="24"/>
+          <w:szCs w:val="24"/>
+          <w:lang w:val="en-AU" w:eastAsia="en-AU"/>
+          <w14:ligatures w14:val="standardContextual"/>
         </w:rPr>
       </w:pPr>
-      <w:hyperlink w:anchor="_Toc231809605" w:history="1">
+      <w:hyperlink w:anchor="_Toc231819119" w:history="1">
         <w:r>
           <w:rPr>
             <w:rStyle w:val="Hyperlink"/>
@@ -2267,7 +2509,7 @@
             <w:noProof/>
             <w:webHidden/>
           </w:rPr>
-          <w:instrText xml:space="preserve"> PAGEREF _Toc231809605 \h </w:instrText>
+          <w:instrText xml:space="preserve"> PAGEREF _Toc231819119 \h </w:instrText>
         </w:r>
         <w:r>
           <w:rPr>
@@ -2305,10 +2547,17 @@
           <w:tab w:val="right" w:leader="dot" w:pos="9402"/>
         </w:tabs>
         <w:rPr>
+          <w:rFonts w:asciiTheme="minorHAnsi" w:eastAsiaTheme="minorEastAsia" w:hAnsiTheme="minorHAnsi"/>
           <w:noProof/>
+          <w:color w:val="auto"/>
+          <w:kern w:val="2"/>
+          <w:sz w:val="24"/>
+          <w:szCs w:val="24"/>
+          <w:lang w:val="en-AU" w:eastAsia="en-AU"/>
+          <w14:ligatures w14:val="standardContextual"/>
         </w:rPr>
       </w:pPr>
-      <w:hyperlink w:anchor="_Toc231809606" w:history="1">
+      <w:hyperlink w:anchor="_Toc231819120" w:history="1">
         <w:r>
           <w:rPr>
             <w:rStyle w:val="Hyperlink"/>
@@ -2335,7 +2584,7 @@
             <w:noProof/>
             <w:webHidden/>
           </w:rPr>
-          <w:instrText xml:space="preserve"> PAGEREF _Toc231809606 \h </w:instrText>
+          <w:instrText xml:space="preserve"> PAGEREF _Toc231819120 \h </w:instrText>
         </w:r>
         <w:r>
           <w:rPr>
@@ -2373,10 +2622,17 @@
           <w:tab w:val="right" w:leader="dot" w:pos="9402"/>
         </w:tabs>
         <w:rPr>
+          <w:rFonts w:asciiTheme="minorHAnsi" w:eastAsiaTheme="minorEastAsia" w:hAnsiTheme="minorHAnsi"/>
           <w:noProof/>
+          <w:color w:val="auto"/>
+          <w:kern w:val="2"/>
+          <w:sz w:val="24"/>
+          <w:szCs w:val="24"/>
+          <w:lang w:val="en-AU" w:eastAsia="en-AU"/>
+          <w14:ligatures w14:val="standardContextual"/>
         </w:rPr>
       </w:pPr>
-      <w:hyperlink w:anchor="_Toc231809607" w:history="1">
+      <w:hyperlink w:anchor="_Toc231819121" w:history="1">
         <w:r>
           <w:rPr>
             <w:rStyle w:val="Hyperlink"/>
@@ -2403,7 +2659,7 @@
             <w:noProof/>
             <w:webHidden/>
           </w:rPr>
-          <w:instrText xml:space="preserve"> PAGEREF _Toc231809607 \h </w:instrText>
+          <w:instrText xml:space="preserve"> PAGEREF _Toc231819121 \h </w:instrText>
         </w:r>
         <w:r>
           <w:rPr>
@@ -2455,7 +2711,7 @@
       <w:pPr>
         <w:pStyle w:val="Heading1"/>
       </w:pPr>
-      <w:bookmarkStart w:id="1" w:name="_Toc231809579"/>
+      <w:bookmarkStart w:id="1" w:name="_Toc231819093"/>
       <w:r>
         <w:lastRenderedPageBreak/>
         <w:t>1. Purpose and Scope</w:t>
@@ -2471,7 +2727,7 @@
       <w:pPr>
         <w:pStyle w:val="Heading3"/>
       </w:pPr>
-      <w:bookmarkStart w:id="2" w:name="_Toc231809580"/>
+      <w:bookmarkStart w:id="2" w:name="_Toc231819094"/>
       <w:r>
         <w:t>In scope of this design</w:t>
       </w:r>
@@ -2489,8 +2745,13 @@
       <w:pPr>
         <w:pStyle w:val="ListBullet"/>
       </w:pPr>
+      <w:proofErr w:type="spellStart"/>
       <w:r>
-        <w:t>Compute, networking, identity, storage, database and a basic monitoring baseline sufficient to run the website as a single-instance LAMP workload in AWS.</w:t>
+        <w:t>Compute</w:t>
+      </w:r>
+      <w:proofErr w:type="spellEnd"/>
+      <w:r>
+        <w:t>, networking, identity, storage, database and a basic monitoring baseline sufficient to run the website as a single-instance LAMP workload in AWS.</w:t>
       </w:r>
     </w:p>
     <w:p>
@@ -2513,7 +2774,7 @@
       <w:pPr>
         <w:pStyle w:val="Heading3"/>
       </w:pPr>
-      <w:bookmarkStart w:id="3" w:name="_Toc231809581"/>
+      <w:bookmarkStart w:id="3" w:name="_Toc231819095"/>
       <w:r>
         <w:t>Out of scope — deferred (accepted pilot limitations)</w:t>
       </w:r>
@@ -2524,7 +2785,15 @@
         <w:pStyle w:val="ListBullet"/>
       </w:pPr>
       <w:r>
-        <w:t>High availability of any kind: no load balancer, no autoscaling, no Multi-AZ database, no cross-AZ resilience.</w:t>
+        <w:t xml:space="preserve">High availability of any kind: no load balancer, no autoscaling, no </w:t>
+      </w:r>
+      <w:proofErr w:type="gramStart"/>
+      <w:r>
+        <w:t>Multi-AZ</w:t>
+      </w:r>
+      <w:proofErr w:type="gramEnd"/>
+      <w:r>
+        <w:t xml:space="preserve"> database, no cross-AZ resilience.</w:t>
       </w:r>
     </w:p>
     <w:p>
@@ -2555,7 +2824,7 @@
       <w:pPr>
         <w:pStyle w:val="Heading3"/>
       </w:pPr>
-      <w:bookmarkStart w:id="4" w:name="_Toc231809582"/>
+      <w:bookmarkStart w:id="4" w:name="_Toc231819096"/>
       <w:r>
         <w:t>Out of MTS scope entirely — YAT responsibility</w:t>
       </w:r>
@@ -2589,7 +2858,7 @@
       <w:pPr>
         <w:pStyle w:val="Heading1"/>
       </w:pPr>
-      <w:bookmarkStart w:id="5" w:name="_Toc231809583"/>
+      <w:bookmarkStart w:id="5" w:name="_Toc231819097"/>
       <w:r>
         <w:t>2. Design Inputs and Requirements</w:t>
       </w:r>
@@ -2599,7 +2868,7 @@
       <w:pPr>
         <w:pStyle w:val="Heading3"/>
       </w:pPr>
-      <w:bookmarkStart w:id="6" w:name="_Toc231809584"/>
+      <w:bookmarkStart w:id="6" w:name="_Toc231819098"/>
       <w:r>
         <w:t>2.1 Inputs</w:t>
       </w:r>
@@ -2641,7 +2910,7 @@
       <w:pPr>
         <w:pStyle w:val="Heading3"/>
       </w:pPr>
-      <w:bookmarkStart w:id="7" w:name="_Toc231809585"/>
+      <w:bookmarkStart w:id="7" w:name="_Toc231819099"/>
       <w:r>
         <w:t>2.2 Requirements the design must meet</w:t>
       </w:r>
@@ -3021,7 +3290,7 @@
       <w:pPr>
         <w:pStyle w:val="Heading1"/>
       </w:pPr>
-      <w:bookmarkStart w:id="8" w:name="_Toc231809586"/>
+      <w:bookmarkStart w:id="8" w:name="_Toc231819100"/>
       <w:r>
         <w:t>3. Review of the Existing (On-Premises) Architecture</w:t>
       </w:r>
@@ -3029,14 +3298,22 @@
     </w:p>
     <w:p>
       <w:r>
-        <w:t>Unlike a greenfield build, this engagement migrated a running system. The source was a single on-premises web server at the Cremorne campus hosting the CMS (PHP/MySQL on a LAMP stack), its MySQL database, and uploaded media on local disk, behind the campus internet connection. It was a single point of failure with no redundancy, strained during the enrolment-enquiry peak, and approaching end of warranty. The cloud baseline below re-hosts this same stack as-is; it improves the hardware and elasticity position but deliberately reproduces the single-instance shape (now in AWS) rather than re-architecting for availability.</w:t>
+        <w:t xml:space="preserve">Unlike a greenfield build, this engagement </w:t>
+      </w:r>
+      <w:proofErr w:type="gramStart"/>
+      <w:r>
+        <w:t>migrated</w:t>
+      </w:r>
+      <w:proofErr w:type="gramEnd"/>
+      <w:r>
+        <w:t xml:space="preserve"> a running system. The source was a single on-premises web server at the Cremorne campus hosting the CMS (PHP/MySQL on a LAMP stack), its MySQL database, and uploaded media on local disk, behind the campus internet connection. It was a single point of failure with no redundancy, strained during the enrolment-enquiry peak, and approaching end of warranty. The cloud baseline below re-hosts this same stack as-is; it improves the hardware and elasticity position but deliberately reproduces the single-instance shape (now in AWS) rather than re-architecting for availability.</w:t>
       </w:r>
     </w:p>
     <w:p>
       <w:pPr>
         <w:pStyle w:val="Heading1"/>
       </w:pPr>
-      <w:bookmarkStart w:id="9" w:name="_Toc231809587"/>
+      <w:bookmarkStart w:id="9" w:name="_Toc231819101"/>
       <w:r>
         <w:t>4. Architecture Design</w:t>
       </w:r>
@@ -3046,7 +3323,7 @@
       <w:pPr>
         <w:pStyle w:val="Heading3"/>
       </w:pPr>
-      <w:bookmarkStart w:id="10" w:name="_Toc231809588"/>
+      <w:bookmarkStart w:id="10" w:name="_Toc231819102"/>
       <w:r>
         <w:t>4.1 Assumptions and constraints</w:t>
       </w:r>
@@ -3518,7 +3795,7 @@
       <w:pPr>
         <w:pStyle w:val="Heading3"/>
       </w:pPr>
-      <w:bookmarkStart w:id="11" w:name="_Toc231809589"/>
+      <w:bookmarkStart w:id="11" w:name="_Toc231819103"/>
       <w:r>
         <w:t>4.2 AWS account and region</w:t>
       </w:r>
@@ -3533,7 +3810,7 @@
       <w:pPr>
         <w:pStyle w:val="Heading3"/>
       </w:pPr>
-      <w:bookmarkStart w:id="12" w:name="_Toc231809590"/>
+      <w:bookmarkStart w:id="12" w:name="_Toc231819104"/>
       <w:r>
         <w:t>4.3 Identity and Access Management (IAM)</w:t>
       </w:r>
@@ -3840,7 +4117,7 @@
       <w:pPr>
         <w:pStyle w:val="Heading3"/>
       </w:pPr>
-      <w:bookmarkStart w:id="13" w:name="_Toc231809591"/>
+      <w:bookmarkStart w:id="13" w:name="_Toc231819105"/>
       <w:r>
         <w:t>4.4 Network topology</w:t>
       </w:r>
@@ -4143,7 +4420,15 @@
         <w:pStyle w:val="ListBullet"/>
       </w:pPr>
       <w:r>
-        <w:t>There is no second AZ and no -b subnets — the single-AZ shape is the defining property of the baseline.</w:t>
+        <w:t xml:space="preserve">There is no second AZ and </w:t>
+      </w:r>
+      <w:proofErr w:type="gramStart"/>
+      <w:r>
+        <w:t>no -b</w:t>
+      </w:r>
+      <w:proofErr w:type="gramEnd"/>
+      <w:r>
+        <w:t xml:space="preserve"> subnets — the single-AZ shape is the defining property of the baseline.</w:t>
       </w:r>
     </w:p>
     <w:tbl>
@@ -4180,20 +4465,47 @@
                 <w:color w:val="C5613B"/>
                 <w:sz w:val="22"/>
               </w:rPr>
-              <w:t>[ NETWORK TOPOLOGY DIAGRAM — PASTE HERE ]</w:t>
-            </w:r>
-          </w:p>
-          <w:p>
-            <w:pPr>
-              <w:jc w:val="center"/>
-            </w:pPr>
-            <w:r>
-              <w:rPr>
-                <w:i/>
-                <w:color w:val="6B6660"/>
-                <w:sz w:val="18"/>
-              </w:rPr>
-              <w:t>Source diagram: website-baseline-single-az.drawio</w:t>
+              <w:drawing>
+                <wp:inline distT="0" distB="0" distL="0" distR="0" wp14:anchorId="7402C4DA" wp14:editId="7BBABE66">
+                  <wp:extent cx="5400136" cy="3388568"/>
+                  <wp:effectExtent l="0" t="0" r="0" b="2540"/>
+                  <wp:docPr id="1988610181" name="Graphic 1"/>
+                  <wp:cNvGraphicFramePr>
+                    <a:graphicFrameLocks xmlns:a="http://schemas.openxmlformats.org/drawingml/2006/main" noChangeAspect="1"/>
+                  </wp:cNvGraphicFramePr>
+                  <a:graphic xmlns:a="http://schemas.openxmlformats.org/drawingml/2006/main">
+                    <a:graphicData uri="http://schemas.openxmlformats.org/drawingml/2006/picture">
+                      <pic:pic xmlns:pic="http://schemas.openxmlformats.org/drawingml/2006/picture">
+                        <pic:nvPicPr>
+                          <pic:cNvPr id="1988610181" name=""/>
+                          <pic:cNvPicPr/>
+                        </pic:nvPicPr>
+                        <pic:blipFill>
+                          <a:blip r:embed="rId12">
+                            <a:extLst>
+                              <a:ext uri="{96DAC541-7B7A-43D3-8B79-37D633B846F1}">
+                                <asvg:svgBlip xmlns:asvg="http://schemas.microsoft.com/office/drawing/2016/SVG/main" r:embed="rId13"/>
+                              </a:ext>
+                            </a:extLst>
+                          </a:blip>
+                          <a:stretch>
+                            <a:fillRect/>
+                          </a:stretch>
+                        </pic:blipFill>
+                        <pic:spPr>
+                          <a:xfrm>
+                            <a:off x="0" y="0"/>
+                            <a:ext cx="5409278" cy="3394304"/>
+                          </a:xfrm>
+                          <a:prstGeom prst="rect">
+                            <a:avLst/>
+                          </a:prstGeom>
+                        </pic:spPr>
+                      </pic:pic>
+                    </a:graphicData>
+                  </a:graphic>
+                </wp:inline>
+              </w:drawing>
             </w:r>
           </w:p>
         </w:tc>
@@ -4216,7 +4528,7 @@
       <w:pPr>
         <w:pStyle w:val="Heading3"/>
       </w:pPr>
-      <w:bookmarkStart w:id="14" w:name="_Toc231809592"/>
+      <w:bookmarkStart w:id="14" w:name="_Toc231819106"/>
       <w:r>
         <w:t>4.5 Compute (single EC2 instance)</w:t>
       </w:r>
@@ -4227,7 +4539,15 @@
         <w:pStyle w:val="ListBullet"/>
       </w:pPr>
       <w:r>
-        <w:t>A single EC2 instance (e.g. t3.small/medium — final type an implementer decision) running the LAMP stack and the CMS, in public-web-a with an Elastic IP.</w:t>
+        <w:t>A single EC2 instance (e.g. t</w:t>
+      </w:r>
+      <w:proofErr w:type="gramStart"/>
+      <w:r>
+        <w:t>3.small</w:t>
+      </w:r>
+      <w:proofErr w:type="gramEnd"/>
+      <w:r>
+        <w:t>/medium — final type an implementer decision) running the LAMP stack and the CMS, in public-web-a with an Elastic IP.</w:t>
       </w:r>
     </w:p>
     <w:p>
@@ -4235,7 +4555,23 @@
         <w:pStyle w:val="ListBullet"/>
       </w:pPr>
       <w:r>
-        <w:t>No Auto Scaling Group and no load balancer: the instance is the website. This is the principal single point of failure, accepted for the pilot.</w:t>
+        <w:t xml:space="preserve">No Auto Scaling Group and </w:t>
+      </w:r>
+      <w:proofErr w:type="gramStart"/>
+      <w:r>
+        <w:t>no load</w:t>
+      </w:r>
+      <w:proofErr w:type="gramEnd"/>
+      <w:r>
+        <w:t xml:space="preserve"> balancer: the instance is the website. This is the principal single point of failure, accepted </w:t>
+      </w:r>
+      <w:proofErr w:type="gramStart"/>
+      <w:r>
+        <w:t>for</w:t>
+      </w:r>
+      <w:proofErr w:type="gramEnd"/>
+      <w:r>
+        <w:t xml:space="preserve"> the pilot.</w:t>
       </w:r>
     </w:p>
     <w:p>
@@ -4250,7 +4586,7 @@
       <w:pPr>
         <w:pStyle w:val="Heading3"/>
       </w:pPr>
-      <w:bookmarkStart w:id="15" w:name="_Toc231809593"/>
+      <w:bookmarkStart w:id="15" w:name="_Toc231819107"/>
       <w:r>
         <w:lastRenderedPageBreak/>
         <w:t>4.6 TLS / HTTPS</w:t>
@@ -4270,14 +4606,22 @@
         <w:pStyle w:val="ListBullet"/>
       </w:pPr>
       <w:r>
-        <w:t>The certificate mechanism (e.g. an automatically-renewed certificate on the instance vs an imported certificate) is an implementer decision.</w:t>
+        <w:t xml:space="preserve">The certificate mechanism (e.g. an </w:t>
+      </w:r>
+      <w:proofErr w:type="gramStart"/>
+      <w:r>
+        <w:t>automatically-renewed</w:t>
+      </w:r>
+      <w:proofErr w:type="gramEnd"/>
+      <w:r>
+        <w:t xml:space="preserve"> certificate on the instance vs an imported certificate) is an implementer decision.</w:t>
       </w:r>
     </w:p>
     <w:p>
       <w:pPr>
         <w:pStyle w:val="Heading3"/>
       </w:pPr>
-      <w:bookmarkStart w:id="16" w:name="_Toc231809594"/>
+      <w:bookmarkStart w:id="16" w:name="_Toc231819108"/>
       <w:r>
         <w:t>4.7 Database (RDS)</w:t>
       </w:r>
@@ -4296,7 +4640,15 @@
         <w:pStyle w:val="ListBullet"/>
       </w:pPr>
       <w:r>
-        <w:t>A small general-purpose instance class (e.g. db.t3.small — an implementer decision); gp3 storage sized to footprint + growth.</w:t>
+        <w:t>A small general-purpose instance class (e.g. db.t</w:t>
+      </w:r>
+      <w:proofErr w:type="gramStart"/>
+      <w:r>
+        <w:t>3.small</w:t>
+      </w:r>
+      <w:proofErr w:type="gramEnd"/>
+      <w:r>
+        <w:t xml:space="preserve"> — an implementer decision); gp3 storage sized to footprint + growth.</w:t>
       </w:r>
     </w:p>
     <w:p>
@@ -4319,7 +4671,7 @@
       <w:pPr>
         <w:pStyle w:val="Heading3"/>
       </w:pPr>
-      <w:bookmarkStart w:id="17" w:name="_Toc231809595"/>
+      <w:bookmarkStart w:id="17" w:name="_Toc231819109"/>
       <w:r>
         <w:t>4.8 Storage</w:t>
       </w:r>
@@ -4540,7 +4892,15 @@
         <w:pStyle w:val="ListBullet"/>
       </w:pPr>
       <w:r>
-        <w:t>Backups bucket: block all public access; SSE-S3 encryption; versioning enabled.</w:t>
+        <w:t xml:space="preserve">Backups </w:t>
+      </w:r>
+      <w:proofErr w:type="gramStart"/>
+      <w:r>
+        <w:t>bucket:</w:t>
+      </w:r>
+      <w:proofErr w:type="gramEnd"/>
+      <w:r>
+        <w:t xml:space="preserve"> block all public access; SSE-S3 encryption; versioning enabled.</w:t>
       </w:r>
     </w:p>
     <w:p>
@@ -4555,7 +4915,7 @@
       <w:pPr>
         <w:pStyle w:val="Heading3"/>
       </w:pPr>
-      <w:bookmarkStart w:id="18" w:name="_Toc231809596"/>
+      <w:bookmarkStart w:id="18" w:name="_Toc231819110"/>
       <w:r>
         <w:t>4.9 Security</w:t>
       </w:r>
@@ -4701,7 +5061,21 @@
               <w:rPr>
                 <w:sz w:val="18"/>
               </w:rPr>
-              <w:t>MySQL:3306 to sg-db; HTTPS to AWS APIs / updates</w:t>
+              <w:t>MySQL:3306 to sg-</w:t>
+            </w:r>
+            <w:proofErr w:type="spellStart"/>
+            <w:r>
+              <w:rPr>
+                <w:sz w:val="18"/>
+              </w:rPr>
+              <w:t>db</w:t>
+            </w:r>
+            <w:proofErr w:type="spellEnd"/>
+            <w:r>
+              <w:rPr>
+                <w:sz w:val="18"/>
+              </w:rPr>
+              <w:t>; HTTPS to AWS APIs / updates</w:t>
             </w:r>
           </w:p>
         </w:tc>
@@ -4726,8 +5100,17 @@
                 <w:b/>
                 <w:sz w:val="18"/>
               </w:rPr>
-              <w:t>sg-db</w:t>
+              <w:t>sg-</w:t>
             </w:r>
+            <w:proofErr w:type="spellStart"/>
+            <w:r>
+              <w:rPr>
+                <w:b/>
+                <w:sz w:val="18"/>
+              </w:rPr>
+              <w:t>db</w:t>
+            </w:r>
+            <w:proofErr w:type="spellEnd"/>
           </w:p>
         </w:tc>
         <w:tc>
@@ -4807,7 +5190,7 @@
       <w:pPr>
         <w:pStyle w:val="Heading3"/>
       </w:pPr>
-      <w:bookmarkStart w:id="19" w:name="_Toc231809597"/>
+      <w:bookmarkStart w:id="19" w:name="_Toc231819111"/>
       <w:r>
         <w:t>4.10 Monitoring (baseline)</w:t>
       </w:r>
@@ -5071,7 +5454,7 @@
       <w:pPr>
         <w:pStyle w:val="Heading3"/>
       </w:pPr>
-      <w:bookmarkStart w:id="20" w:name="_Toc231809598"/>
+      <w:bookmarkStart w:id="20" w:name="_Toc231819112"/>
       <w:r>
         <w:t>4.11 Naming and tagging conventions</w:t>
       </w:r>
@@ -5079,7 +5462,15 @@
     </w:p>
     <w:p>
       <w:r>
-        <w:t>Naming pattern yat-web-&lt;resource-type&gt;-&lt;env&gt; (e.g. yat-web-ec2-prod). Mandatory tags:</w:t>
+        <w:t xml:space="preserve">Naming pattern </w:t>
+      </w:r>
+      <w:proofErr w:type="spellStart"/>
+      <w:r>
+        <w:t>yat</w:t>
+      </w:r>
+      <w:proofErr w:type="spellEnd"/>
+      <w:r>
+        <w:t>-web-&lt;resource-type&gt;-&lt;env&gt; (e.g. yat-web-ec2-prod). Mandatory tags:</w:t>
       </w:r>
     </w:p>
     <w:tbl>
@@ -5288,6 +5679,7 @@
             </w:tcBorders>
           </w:tcPr>
           <w:p>
+            <w:proofErr w:type="spellStart"/>
             <w:r>
               <w:rPr>
                 <w:b/>
@@ -5295,6 +5687,7 @@
               </w:rPr>
               <w:t>ManagedBy</w:t>
             </w:r>
+            <w:proofErr w:type="spellEnd"/>
           </w:p>
         </w:tc>
         <w:tc>
@@ -5332,6 +5725,7 @@
             </w:tcBorders>
           </w:tcPr>
           <w:p>
+            <w:proofErr w:type="spellStart"/>
             <w:r>
               <w:rPr>
                 <w:b/>
@@ -5339,6 +5733,7 @@
               </w:rPr>
               <w:t>CostCentre</w:t>
             </w:r>
+            <w:proofErr w:type="spellEnd"/>
           </w:p>
         </w:tc>
         <w:tc>
@@ -5376,6 +5771,7 @@
             </w:tcBorders>
           </w:tcPr>
           <w:p>
+            <w:proofErr w:type="spellStart"/>
             <w:r>
               <w:rPr>
                 <w:b/>
@@ -5383,6 +5779,7 @@
               </w:rPr>
               <w:t>DataClassification</w:t>
             </w:r>
+            <w:proofErr w:type="spellEnd"/>
           </w:p>
         </w:tc>
         <w:tc>
@@ -5411,7 +5808,7 @@
       <w:pPr>
         <w:pStyle w:val="Heading3"/>
       </w:pPr>
-      <w:bookmarkStart w:id="21" w:name="_Toc231809599"/>
+      <w:bookmarkStart w:id="21" w:name="_Toc231819113"/>
       <w:r>
         <w:t>4.12 Backup</w:t>
       </w:r>
@@ -5702,7 +6099,7 @@
       <w:pPr>
         <w:pStyle w:val="Heading3"/>
       </w:pPr>
-      <w:bookmarkStart w:id="22" w:name="_Toc231809600"/>
+      <w:bookmarkStart w:id="22" w:name="_Toc231819114"/>
       <w:r>
         <w:t>4.13 Recovery objectives — baseline state</w:t>
       </w:r>
@@ -5710,14 +6107,22 @@
     </w:p>
     <w:p>
       <w:r>
-        <w:t>The baseline's recovery posture is backup-based and unmeasured: recovery means rebuilding the single instance and restoring from the most recent backup. No RTO or RPO was committed for the pilot. There is no second-AZ or second-region fallback. This is the principal gap a future engagement (and any disaster-recovery plan) would address.</w:t>
+        <w:t xml:space="preserve">The baseline's recovery posture is backup-based and unmeasured: recovery means rebuilding the single instance and restoring from the most recent backup. No RTO or RPO was committed </w:t>
+      </w:r>
+      <w:proofErr w:type="gramStart"/>
+      <w:r>
+        <w:t>for</w:t>
+      </w:r>
+      <w:proofErr w:type="gramEnd"/>
+      <w:r>
+        <w:t xml:space="preserve"> the pilot. There is no second-AZ or second-region fallback. This is the principal gap a future engagement (and any disaster-recovery plan) would address.</w:t>
       </w:r>
     </w:p>
     <w:p>
       <w:pPr>
         <w:pStyle w:val="Heading3"/>
       </w:pPr>
-      <w:bookmarkStart w:id="23" w:name="_Toc231809601"/>
+      <w:bookmarkStart w:id="23" w:name="_Toc231819115"/>
       <w:r>
         <w:t>4.14 Single points of failure (known and accepted)</w:t>
       </w:r>
@@ -5741,7 +6146,15 @@
         <w:pStyle w:val="ListBullet"/>
       </w:pPr>
       <w:r>
-        <w:t>The single Availability Zone — an AZ-level event takes everything down.</w:t>
+        <w:t xml:space="preserve">The single Availability Zone — an AZ-level </w:t>
+      </w:r>
+      <w:proofErr w:type="gramStart"/>
+      <w:r>
+        <w:t>event</w:t>
+      </w:r>
+      <w:proofErr w:type="gramEnd"/>
+      <w:r>
+        <w:t xml:space="preserve"> takes everything down.</w:t>
       </w:r>
     </w:p>
     <w:p>
@@ -5764,7 +6177,7 @@
       <w:pPr>
         <w:pStyle w:val="Heading3"/>
       </w:pPr>
-      <w:bookmarkStart w:id="24" w:name="_Toc231809602"/>
+      <w:bookmarkStart w:id="24" w:name="_Toc231819116"/>
       <w:r>
         <w:t>4.15 Configuration decisions left to the implementer</w:t>
       </w:r>
@@ -6174,7 +6587,7 @@
       <w:pPr>
         <w:pStyle w:val="Heading1"/>
       </w:pPr>
-      <w:bookmarkStart w:id="25" w:name="_Toc231809603"/>
+      <w:bookmarkStart w:id="25" w:name="_Toc231819117"/>
       <w:r>
         <w:t>5. Implementation Sequencing</w:t>
       </w:r>
@@ -6182,7 +6595,15 @@
     </w:p>
     <w:p>
       <w:r>
-        <w:t>Because this migrated a live website, the build was sequenced around a cutover timed to avoid the enrolment-enquiry peak:</w:t>
+        <w:t xml:space="preserve">Because this migrated a live website, the </w:t>
+      </w:r>
+      <w:proofErr w:type="gramStart"/>
+      <w:r>
+        <w:t>build</w:t>
+      </w:r>
+      <w:proofErr w:type="gramEnd"/>
+      <w:r>
+        <w:t xml:space="preserve"> was sequenced around a cutover timed to avoid the enrolment-enquiry peak:</w:t>
       </w:r>
     </w:p>
     <w:p>
@@ -6229,15 +6650,20 @@
       <w:pPr>
         <w:pStyle w:val="ListBullet"/>
       </w:pPr>
+      <w:proofErr w:type="spellStart"/>
       <w:r>
-        <w:t>Stabilise, then hand over documentation and the operations runbook to YAT ICT.</w:t>
+        <w:t>Stabilise</w:t>
+      </w:r>
+      <w:proofErr w:type="spellEnd"/>
+      <w:r>
+        <w:t>, then hand over documentation and the operations runbook to YAT ICT.</w:t>
       </w:r>
     </w:p>
     <w:p>
       <w:pPr>
         <w:pStyle w:val="Heading1"/>
       </w:pPr>
-      <w:bookmarkStart w:id="26" w:name="_Toc231809604"/>
+      <w:bookmarkStart w:id="26" w:name="_Toc231819118"/>
       <w:r>
         <w:t>6. Verification Plan</w:t>
       </w:r>
@@ -6254,14 +6680,46 @@
           <w:b/>
           <w:color w:val="C5613B"/>
         </w:rPr>
-        <w:t>Not applicable — failure-simulation and availability verification do not apply to this baseline — there is no redundancy to fail over to. Resilience testing is a matter for a future high-availability and disaster-recovery engagement.</w:t>
+        <w:t xml:space="preserve">Not applicable — failure-simulation and availability verification do not apply to this baseline — there is no redundancy to fail over </w:t>
+      </w:r>
+      <w:proofErr w:type="gramStart"/>
+      <w:r>
+        <w:rPr>
+          <w:b/>
+          <w:color w:val="C5613B"/>
+        </w:rPr>
+        <w:t>to</w:t>
+      </w:r>
+      <w:proofErr w:type="gramEnd"/>
+      <w:r>
+        <w:rPr>
+          <w:b/>
+          <w:color w:val="C5613B"/>
+        </w:rPr>
+        <w:t xml:space="preserve">. Resilience testing is a matter for </w:t>
+      </w:r>
+      <w:proofErr w:type="gramStart"/>
+      <w:r>
+        <w:rPr>
+          <w:b/>
+          <w:color w:val="C5613B"/>
+        </w:rPr>
+        <w:t>a future</w:t>
+      </w:r>
+      <w:proofErr w:type="gramEnd"/>
+      <w:r>
+        <w:rPr>
+          <w:b/>
+          <w:color w:val="C5613B"/>
+        </w:rPr>
+        <w:t xml:space="preserve"> high-availability and disaster-recovery engagement.</w:t>
       </w:r>
     </w:p>
     <w:p>
       <w:pPr>
         <w:pStyle w:val="Heading1"/>
       </w:pPr>
-      <w:bookmarkStart w:id="27" w:name="_Toc231809605"/>
+      <w:bookmarkStart w:id="27" w:name="_Toc231819119"/>
       <w:r>
         <w:t>7. Out of Scope</w:t>
       </w:r>
@@ -6324,7 +6782,7 @@
       <w:pPr>
         <w:pStyle w:val="Heading1"/>
       </w:pPr>
-      <w:bookmarkStart w:id="28" w:name="_Toc231809606"/>
+      <w:bookmarkStart w:id="28" w:name="_Toc231819120"/>
       <w:r>
         <w:t>8. References</w:t>
       </w:r>
@@ -6358,7 +6816,7 @@
       <w:pPr>
         <w:pStyle w:val="Heading1"/>
       </w:pPr>
-      <w:bookmarkStart w:id="29" w:name="_Toc231809607"/>
+      <w:bookmarkStart w:id="29" w:name="_Toc231819121"/>
       <w:r>
         <w:lastRenderedPageBreak/>
         <w:t>Document control</w:t>
@@ -6551,7 +7009,21 @@
               <w:rPr>
                 <w:sz w:val="18"/>
               </w:rPr>
-              <w:t>Pat Lin (MTS Senior Consultant) · Sam Walker (YAT ICT Manager)</w:t>
+              <w:t xml:space="preserve">Pat Lin (MTS Senior </w:t>
+            </w:r>
+            <w:proofErr w:type="gramStart"/>
+            <w:r>
+              <w:rPr>
+                <w:sz w:val="18"/>
+              </w:rPr>
+              <w:t>Consultant) ·</w:t>
+            </w:r>
+            <w:proofErr w:type="gramEnd"/>
+            <w:r>
+              <w:rPr>
+                <w:sz w:val="18"/>
+              </w:rPr>
+              <w:t xml:space="preserve"> Sam Walker (YAT ICT Manager)</w:t>
             </w:r>
           </w:p>
         </w:tc>
@@ -6595,7 +7067,21 @@
               <w:rPr>
                 <w:sz w:val="18"/>
               </w:rPr>
-              <w:t>YAT Website Cloud Migration (2023) — closed 12 May 2023</w:t>
+              <w:t>YAT Website Cloud Migration (</w:t>
+            </w:r>
+            <w:proofErr w:type="gramStart"/>
+            <w:r>
+              <w:rPr>
+                <w:sz w:val="18"/>
+              </w:rPr>
+              <w:t>2023) —</w:t>
+            </w:r>
+            <w:proofErr w:type="gramEnd"/>
+            <w:r>
+              <w:rPr>
+                <w:sz w:val="18"/>
+              </w:rPr>
+              <w:t xml:space="preserve"> closed 12 May 2023</w:t>
             </w:r>
           </w:p>
         </w:tc>
@@ -6647,8 +7133,8 @@
     </w:tbl>
     <w:p/>
     <w:sectPr>
-      <w:headerReference w:type="default" r:id="rId12"/>
-      <w:footerReference w:type="default" r:id="rId13"/>
+      <w:headerReference w:type="default" r:id="rId14"/>
+      <w:footerReference w:type="default" r:id="rId15"/>
       <w:pgSz w:w="11906" w:h="16838"/>
       <w:pgMar w:top="1474" w:right="1247" w:bottom="1247" w:left="1247" w:header="567" w:footer="567" w:gutter="0"/>
       <w:cols w:space="720"/>
@@ -6955,7 +7441,23 @@
         <w:b/>
         <w:sz w:val="17"/>
       </w:rPr>
-      <w:t>This is a fictional organisation used as a case study in an educational context.</w:t>
+      <w:t xml:space="preserve">This is a fictional </w:t>
+    </w:r>
+    <w:proofErr w:type="spellStart"/>
+    <w:r>
+      <w:rPr>
+        <w:b/>
+        <w:sz w:val="17"/>
+      </w:rPr>
+      <w:t>organisation</w:t>
+    </w:r>
+    <w:proofErr w:type="spellEnd"/>
+    <w:r>
+      <w:rPr>
+        <w:b/>
+        <w:sz w:val="17"/>
+      </w:rPr>
+      <w:t xml:space="preserve"> used as a case study in an educational context.</w:t>
     </w:r>
   </w:p>
 </w:hdr>
@@ -6974,7 +7476,23 @@
         <w:b/>
         <w:sz w:val="17"/>
       </w:rPr>
-      <w:t>This is a fictional organisation used as a case study in an educational context.</w:t>
+      <w:t xml:space="preserve">This is a fictional </w:t>
+    </w:r>
+    <w:proofErr w:type="spellStart"/>
+    <w:r>
+      <w:rPr>
+        <w:b/>
+        <w:sz w:val="17"/>
+      </w:rPr>
+      <w:t>organisation</w:t>
+    </w:r>
+    <w:proofErr w:type="spellEnd"/>
+    <w:r>
+      <w:rPr>
+        <w:b/>
+        <w:sz w:val="17"/>
+      </w:rPr>
+      <w:t xml:space="preserve"> used as a case study in an educational context.</w:t>
     </w:r>
   </w:p>
 </w:hdr>
@@ -6993,7 +7511,23 @@
         <w:b/>
         <w:sz w:val="17"/>
       </w:rPr>
-      <w:t>This is a fictional organisation used as a case study in an educational context.</w:t>
+      <w:t xml:space="preserve">This is a fictional </w:t>
+    </w:r>
+    <w:proofErr w:type="spellStart"/>
+    <w:r>
+      <w:rPr>
+        <w:b/>
+        <w:sz w:val="17"/>
+      </w:rPr>
+      <w:t>organisation</w:t>
+    </w:r>
+    <w:proofErr w:type="spellEnd"/>
+    <w:r>
+      <w:rPr>
+        <w:b/>
+        <w:sz w:val="17"/>
+      </w:rPr>
+      <w:t xml:space="preserve"> used as a case study in an educational context.</w:t>
     </w:r>
   </w:p>
 </w:hdr>

</xml_diff>